<commit_message>
docs(worker-isolation): regenerate BRANCH_DIFF + full patch (35884ee..80632ea); mirror to deliverables/release-evidence
</commit_message>
<xml_diff>
--- a/deliverables/release-evidence/RESPONSIBILITY_TABLE.docx
+++ b/deliverables/release-evidence/RESPONSIBILITY_TABLE.docx
@@ -2,7 +2,7 @@
 <file path=word/document.xml><?xml version="1.0" encoding="utf-8"?>
 <w:document xmlns:w="http://schemas.openxmlformats.org/wordprocessingml/2006/main" xmlns:m="http://schemas.openxmlformats.org/officeDocument/2006/math" xmlns:r="http://schemas.openxmlformats.org/officeDocument/2006/relationships" xmlns:o="urn:schemas-microsoft-com:office:office" xmlns:v="urn:schemas-microsoft-com:vml" xmlns:w10="urn:schemas-microsoft-com:office:word" xmlns:a="http://schemas.openxmlformats.org/drawingml/2006/main" xmlns:pic="http://schemas.openxmlformats.org/drawingml/2006/picture" xmlns:wp="http://schemas.openxmlformats.org/drawingml/2006/wordprocessingDrawing">
   <w:body>
-    <w:bookmarkStart w:id="27" w:name="X89fecbdf3914b9e95c30c08b30d6d3ecceac61c"/>
+    <w:bookmarkStart w:id="30" w:name="X89fecbdf3914b9e95c30c08b30d6d3ecceac61c"/>
     <w:p>
       <w:pPr>
         <w:pStyle w:val="Heading1"/>
@@ -174,7 +174,7 @@
         <w:t xml:space="preserve"> </w:t>
       </w:r>
       <w:r>
-        <w:t xml:space="preserve">(22/22 pass, see</w:t>
+        <w:t xml:space="preserve">(29/29 pass, see</w:t>
       </w:r>
       <w:r>
         <w:t xml:space="preserve"> </w:t>
@@ -186,7 +186,22 @@
         <w:t xml:space="preserve">TEST_RESULTS.md</w:t>
       </w:r>
       <w:r>
-        <w:t xml:space="preserve">).</w:t>
+        <w:t xml:space="preserve">), or the opt-in integration suite</w:t>
+      </w:r>
+      <w:r>
+        <w:t xml:space="preserve"> </w:t>
+      </w:r>
+      <w:r>
+        <w:rPr>
+          <w:rStyle w:val="VerbatimChar"/>
+        </w:rPr>
+        <w:t xml:space="preserve">server/lib/job-isolation.integration.test.ts</w:t>
+      </w:r>
+      <w:r>
+        <w:t xml:space="preserve"> </w:t>
+      </w:r>
+      <w:r>
+        <w:t xml:space="preserve">(real Postgres + Redis + BullMQ + Chromium).</w:t>
       </w:r>
     </w:p>
     <w:bookmarkStart w:id="20" w:name="full-db-pool-inventory-gap-a"/>
@@ -2208,7 +2223,7 @@
               <w:jc w:val="left"/>
             </w:pPr>
             <w:r>
-              <w:t xml:space="preserve">B1, C, E2 (exercised with a detached</w:t>
+              <w:t xml:space="preserve">B1, C, E2 (detached</w:t>
             </w:r>
             <w:r>
               <w:t xml:space="preserve"> </w:t>
@@ -2220,7 +2235,7 @@
               <w:t xml:space="preserve">sleep</w:t>
             </w:r>
             <w:r>
-              <w:t xml:space="preserve">,</w:t>
+              <w:t xml:space="preserve">);</w:t>
             </w:r>
             <w:r>
               <w:t xml:space="preserve"> </w:t>
@@ -2230,13 +2245,22 @@
                 <w:bCs/>
                 <w:b/>
               </w:rPr>
-              <w:t xml:space="preserve">not</w:t>
-            </w:r>
-            <w:r>
-              <w:t xml:space="preserve"> </w:t>
-            </w:r>
-            <w:r>
-              <w:t xml:space="preserve">a real Chromium)</w:t>
+              <w:t xml:space="preserve">integration</w:t>
+            </w:r>
+            <w:r>
+              <w:t xml:space="preserve">: real Chromium launched by two children via</w:t>
+            </w:r>
+            <w:r>
+              <w:t xml:space="preserve"> </w:t>
+            </w:r>
+            <w:r>
+              <w:rPr>
+                <w:rStyle w:val="VerbatimChar"/>
+              </w:rPr>
+              <w:t xml:space="preserve">fetchPdfViaBrowser</w:t>
+            </w:r>
+            <w:r>
+              <w:t xml:space="preserve">, peak 18 Chromium processes, 0 Chromium processes left after completion, 0 orphaned puppeteer profiles on the host</w:t>
             </w:r>
           </w:p>
         </w:tc>
@@ -3152,7 +3176,208 @@
               <w:jc w:val="left"/>
             </w:pPr>
             <w:r>
-              <w:t xml:space="preserve">D row 8</w:t>
+              <w:t xml:space="preserve">D row 8,</w:t>
+            </w:r>
+            <w:r>
+              <w:t xml:space="preserve"> </w:t>
+            </w:r>
+            <w:r>
+              <w:rPr>
+                <w:bCs/>
+                <w:b/>
+              </w:rPr>
+              <w:t xml:space="preserve">M1</w:t>
+            </w:r>
+          </w:p>
+        </w:tc>
+      </w:tr>
+      <w:tr>
+        <w:tc>
+          <w:tcPr/>
+          <w:p>
+            <w:pPr>
+              <w:pStyle w:val="Compact"/>
+              <w:jc w:val="left"/>
+            </w:pPr>
+            <w:r>
+              <w:t xml:space="preserve">Child reported</w:t>
+            </w:r>
+            <w:r>
+              <w:t xml:space="preserve"> </w:t>
+            </w:r>
+            <w:r>
+              <w:rPr>
+                <w:bCs/>
+                <w:b/>
+              </w:rPr>
+              <w:t xml:space="preserve">after</w:t>
+            </w:r>
+            <w:r>
+              <w:t xml:space="preserve"> </w:t>
+            </w:r>
+            <w:r>
+              <w:t xml:space="preserve">a terminal decision (deadline / cancel / revoke)</w:t>
+            </w:r>
+          </w:p>
+        </w:tc>
+        <w:tc>
+          <w:tcPr/>
+          <w:p>
+            <w:pPr>
+              <w:pStyle w:val="Compact"/>
+              <w:jc w:val="left"/>
+            </w:pPr>
+            <w:r>
+              <w:t xml:space="preserve">the terminal decision; the report is discarded (logged,</w:t>
+            </w:r>
+            <w:r>
+              <w:t xml:space="preserve"> </w:t>
+            </w:r>
+            <w:r>
+              <w:rPr>
+                <w:rStyle w:val="VerbatimChar"/>
+              </w:rPr>
+              <w:t xml:space="preserve">lateReportsDiscarded++</w:t>
+            </w:r>
+            <w:r>
+              <w:t xml:space="preserve">)</w:t>
+            </w:r>
+          </w:p>
+        </w:tc>
+        <w:tc>
+          <w:tcPr/>
+          <w:p>
+            <w:pPr>
+              <w:pStyle w:val="Compact"/>
+              <w:jc w:val="left"/>
+            </w:pPr>
+            <w:r>
+              <w:t xml:space="preserve">as the decision row above</w:t>
+            </w:r>
+          </w:p>
+        </w:tc>
+        <w:tc>
+          <w:tcPr/>
+          <w:p>
+            <w:pPr>
+              <w:pStyle w:val="Compact"/>
+              <w:jc w:val="left"/>
+            </w:pPr>
+            <w:r>
+              <w:t xml:space="preserve">yes (in-process, the watchdog race also wins once it has fired)</w:t>
+            </w:r>
+          </w:p>
+        </w:tc>
+        <w:tc>
+          <w:tcPr/>
+          <w:p>
+            <w:pPr>
+              <w:pStyle w:val="Compact"/>
+              <w:jc w:val="left"/>
+            </w:pPr>
+            <w:r>
+              <w:rPr>
+                <w:bCs/>
+                <w:b/>
+              </w:rPr>
+              <w:t xml:space="preserve">M2, M2b, M3</w:t>
+            </w:r>
+          </w:p>
+        </w:tc>
+      </w:tr>
+      <w:tr>
+        <w:tc>
+          <w:tcPr/>
+          <w:p>
+            <w:pPr>
+              <w:pStyle w:val="Compact"/>
+              <w:jc w:val="left"/>
+            </w:pPr>
+            <w:r>
+              <w:t xml:space="preserve">Child exited but its process groups are not confirmed gone</w:t>
+            </w:r>
+          </w:p>
+        </w:tc>
+        <w:tc>
+          <w:tcPr/>
+          <w:p>
+            <w:pPr>
+              <w:pStyle w:val="Compact"/>
+              <w:jc w:val="left"/>
+            </w:pPr>
+            <w:r>
+              <w:rPr>
+                <w:rStyle w:val="VerbatimChar"/>
+              </w:rPr>
+              <w:t xml:space="preserve">Error("Isolated job child cleanup unconfirmed: …")</w:t>
+            </w:r>
+            <w:r>
+              <w:t xml:space="preserve"> </w:t>
+            </w:r>
+            <w:r>
+              <w:t xml:space="preserve">even if it reported success</w:t>
+            </w:r>
+          </w:p>
+        </w:tc>
+        <w:tc>
+          <w:tcPr/>
+          <w:p>
+            <w:pPr>
+              <w:pStyle w:val="Compact"/>
+              <w:jc w:val="left"/>
+            </w:pPr>
+            <w:r>
+              <w:rPr>
+                <w:bCs/>
+                <w:b/>
+              </w:rPr>
+              <w:t xml:space="preserve">non-retriable</w:t>
+            </w:r>
+            <w:r>
+              <w:t xml:space="preserve"> </w:t>
+            </w:r>
+            <w:r>
+              <w:t xml:space="preserve">(</w:t>
+            </w:r>
+            <w:r>
+              <w:rPr>
+                <w:rStyle w:val="VerbatimChar"/>
+              </w:rPr>
+              <w:t xml:space="preserve">retry-policy.ts</w:t>
+            </w:r>
+            <w:r>
+              <w:t xml:space="preserve"> </w:t>
+            </w:r>
+            <w:r>
+              <w:t xml:space="preserve">L31); job fails, permits stay withheld</w:t>
+            </w:r>
+          </w:p>
+        </w:tc>
+        <w:tc>
+          <w:tcPr/>
+          <w:p>
+            <w:pPr>
+              <w:pStyle w:val="Compact"/>
+              <w:jc w:val="left"/>
+            </w:pPr>
+            <w:r>
+              <w:t xml:space="preserve">n/a (new failure mode that only exists with a child)</w:t>
+            </w:r>
+          </w:p>
+        </w:tc>
+        <w:tc>
+          <w:tcPr/>
+          <w:p>
+            <w:pPr>
+              <w:pStyle w:val="Compact"/>
+              <w:jc w:val="left"/>
+            </w:pPr>
+            <w:r>
+              <w:rPr>
+                <w:bCs/>
+                <w:b/>
+              </w:rPr>
+              <w:t xml:space="preserve">Q1</w:t>
             </w:r>
           </w:p>
         </w:tc>
@@ -3418,22 +3643,69 @@
               <w:t xml:space="preserve"> </w:t>
             </w:r>
             <w:r>
-              <w:t xml:space="preserve">runs only after the child has exited and every registered group is gone (L295-300)</w:t>
-            </w:r>
-          </w:p>
-        </w:tc>
-        <w:tc>
-          <w:tcPr/>
-          <w:p>
-            <w:pPr>
-              <w:pStyle w:val="Compact"/>
-              <w:jc w:val="left"/>
-            </w:pPr>
+              <w:t xml:space="preserve">runs only after the child has exited</w:t>
+            </w:r>
+            <w:r>
+              <w:t xml:space="preserve"> </w:t>
+            </w:r>
             <w:r>
               <w:rPr>
                 <w:bCs/>
                 <w:b/>
               </w:rPr>
+              <w:t xml:space="preserve">and</w:t>
+            </w:r>
+            <w:r>
+              <w:t xml:space="preserve"> </w:t>
+            </w:r>
+            <w:r>
+              <w:t xml:space="preserve">the zombie-aware probe confirms every registered group is gone. If not confirmed in</w:t>
+            </w:r>
+            <w:r>
+              <w:t xml:space="preserve"> </w:t>
+            </w:r>
+            <w:r>
+              <w:rPr>
+                <w:rStyle w:val="VerbatimChar"/>
+              </w:rPr>
+              <w:t xml:space="preserve">WORKER_ISOLATION_REAP_WINDOW_MS</w:t>
+            </w:r>
+            <w:r>
+              <w:t xml:space="preserve"> </w:t>
+            </w:r>
+            <w:r>
+              <w:t xml:space="preserve">(2 s), the permits are</w:t>
+            </w:r>
+            <w:r>
+              <w:t xml:space="preserve"> </w:t>
+            </w:r>
+            <w:r>
+              <w:rPr>
+                <w:bCs/>
+                <w:b/>
+              </w:rPr>
+              <w:t xml:space="preserve">withheld</w:t>
+            </w:r>
+            <w:r>
+              <w:t xml:space="preserve"> </w:t>
+            </w:r>
+            <w:r>
+              <w:t xml:space="preserve">in quarantine (section 8)</w:t>
+            </w:r>
+          </w:p>
+        </w:tc>
+        <w:tc>
+          <w:tcPr/>
+          <w:p>
+            <w:pPr>
+              <w:pStyle w:val="Compact"/>
+              <w:jc w:val="left"/>
+            </w:pPr>
+            <w:r>
+              <w:rPr>
+                <w:bCs/>
+                <w:b/>
+              </w:rPr>
               <w:t xml:space="preserve">E2/E3</w:t>
             </w:r>
             <w:r>
@@ -3444,6 +3716,19 @@
                 <w:rStyle w:val="VerbatimChar"/>
               </w:rPr>
               <w:t xml:space="preserve">releasedWhileAlive=false</w:t>
+            </w:r>
+            <w:r>
+              <w:t xml:space="preserve">;</w:t>
+            </w:r>
+            <w:r>
+              <w:t xml:space="preserve"> </w:t>
+            </w:r>
+            <w:r>
+              <w:rPr>
+                <w:bCs/>
+                <w:b/>
+              </w:rPr>
+              <w:t xml:space="preserve">Q1/Q2</w:t>
             </w:r>
           </w:p>
         </w:tc>
@@ -4614,7 +4899,1090 @@
       </w:r>
     </w:p>
     <w:bookmarkEnd w:id="26"/>
+    <w:bookmarkStart w:id="27" w:name="Xf8542bd2322924b5c7db72665ca5bc40b3b894f"/>
+    <w:p>
+      <w:pPr>
+        <w:pStyle w:val="Heading2"/>
+      </w:pPr>
+      <w:r>
+        <w:t xml:space="preserve">8. Unconfirmed descendant cleanup: quarantine (FIX 1)</w:t>
+      </w:r>
+    </w:p>
+    <w:tbl>
+      <w:tblPr>
+        <w:tblStyle w:val="Table"/>
+        <w:tblW w:type="pct" w:w="5000"/>
+        <w:tblLook w:firstRow="1" w:lastRow="0" w:firstColumn="0" w:lastColumn="0" w:noHBand="0" w:noVBand="0" w:val="0020"/>
+        <w:jc w:val="start"/>
+      </w:tblPr>
+      <w:tblGrid>
+        <w:gridCol w:w="2640"/>
+        <w:gridCol w:w="2640"/>
+        <w:gridCol w:w="2640"/>
+      </w:tblGrid>
+      <w:tr>
+        <w:trPr>
+          <w:tblHeader w:val="true"/>
+        </w:trPr>
+        <w:tc>
+          <w:tcPr/>
+          <w:p>
+            <w:pPr>
+              <w:pStyle w:val="Compact"/>
+              <w:jc w:val="left"/>
+            </w:pPr>
+            <w:r>
+              <w:t xml:space="preserve">Step</w:t>
+            </w:r>
+          </w:p>
+        </w:tc>
+        <w:tc>
+          <w:tcPr/>
+          <w:p>
+            <w:pPr>
+              <w:pStyle w:val="Compact"/>
+              <w:jc w:val="left"/>
+            </w:pPr>
+            <w:r>
+              <w:t xml:space="preserve">Mechanism (</w:t>
+            </w:r>
+            <w:r>
+              <w:rPr>
+                <w:rStyle w:val="VerbatimChar"/>
+              </w:rPr>
+              <w:t xml:space="preserve">job-isolation.ts</w:t>
+            </w:r>
+            <w:r>
+              <w:t xml:space="preserve">)</w:t>
+            </w:r>
+          </w:p>
+        </w:tc>
+        <w:tc>
+          <w:tcPr/>
+          <w:p>
+            <w:pPr>
+              <w:pStyle w:val="Compact"/>
+              <w:jc w:val="left"/>
+            </w:pPr>
+            <w:r>
+              <w:t xml:space="preserve">Test</w:t>
+            </w:r>
+          </w:p>
+        </w:tc>
+      </w:tr>
+      <w:tr>
+        <w:tc>
+          <w:tcPr/>
+          <w:p>
+            <w:pPr>
+              <w:pStyle w:val="Compact"/>
+              <w:jc w:val="left"/>
+            </w:pPr>
+            <w:r>
+              <w:t xml:space="preserve">Liveness probe</w:t>
+            </w:r>
+          </w:p>
+        </w:tc>
+        <w:tc>
+          <w:tcPr/>
+          <w:p>
+            <w:pPr>
+              <w:pStyle w:val="Compact"/>
+              <w:jc w:val="left"/>
+            </w:pPr>
+            <w:r>
+              <w:rPr>
+                <w:rStyle w:val="VerbatimChar"/>
+              </w:rPr>
+              <w:t xml:space="preserve">probeGroups</w:t>
+            </w:r>
+            <w:r>
+              <w:t xml:space="preserve"> </w:t>
+            </w:r>
+            <w:r>
+              <w:t xml:space="preserve">(L115): scans</w:t>
+            </w:r>
+            <w:r>
+              <w:t xml:space="preserve"> </w:t>
+            </w:r>
+            <w:r>
+              <w:rPr>
+                <w:rStyle w:val="VerbatimChar"/>
+              </w:rPr>
+              <w:t xml:space="preserve">/proc/*/stat</w:t>
+            </w:r>
+            <w:r>
+              <w:t xml:space="preserve">, reads pgrp (field 5) and state (field 3). A group counts as live only if it has a member whose state is not</w:t>
+            </w:r>
+            <w:r>
+              <w:t xml:space="preserve"> </w:t>
+            </w:r>
+            <w:r>
+              <w:rPr>
+                <w:rStyle w:val="VerbatimChar"/>
+              </w:rPr>
+              <w:t xml:space="preserve">Z</w:t>
+            </w:r>
+            <w:r>
+              <w:t xml:space="preserve">.</w:t>
+            </w:r>
+            <w:r>
+              <w:t xml:space="preserve"> </w:t>
+            </w:r>
+            <w:r>
+              <w:rPr>
+                <w:rStyle w:val="VerbatimChar"/>
+              </w:rPr>
+              <w:t xml:space="preserve">kill(-g,0)</w:t>
+            </w:r>
+            <w:r>
+              <w:t xml:space="preserve"> </w:t>
+            </w:r>
+            <w:r>
+              <w:t xml:space="preserve">alone cannot tell a zombie from a live process. If</w:t>
+            </w:r>
+            <w:r>
+              <w:t xml:space="preserve"> </w:t>
+            </w:r>
+            <w:r>
+              <w:rPr>
+                <w:rStyle w:val="VerbatimChar"/>
+              </w:rPr>
+              <w:t xml:space="preserve">/proc</w:t>
+            </w:r>
+            <w:r>
+              <w:t xml:space="preserve"> </w:t>
+            </w:r>
+            <w:r>
+              <w:t xml:space="preserve">is unreadable, it falls back to</w:t>
+            </w:r>
+            <w:r>
+              <w:t xml:space="preserve"> </w:t>
+            </w:r>
+            <w:r>
+              <w:rPr>
+                <w:rStyle w:val="VerbatimChar"/>
+              </w:rPr>
+              <w:t xml:space="preserve">kill(-g,0)</w:t>
+            </w:r>
+            <w:r>
+              <w:t xml:space="preserve"> </w:t>
+            </w:r>
+            <w:r>
+              <w:t xml:space="preserve">with</w:t>
+            </w:r>
+            <w:r>
+              <w:t xml:space="preserve"> </w:t>
+            </w:r>
+            <w:r>
+              <w:rPr>
+                <w:rStyle w:val="VerbatimChar"/>
+              </w:rPr>
+              <w:t xml:space="preserve">reliable:false</w:t>
+            </w:r>
+            <w:r>
+              <w:t xml:space="preserve"> </w:t>
+            </w:r>
+            <w:r>
+              <w:t xml:space="preserve">and treats every visible group as live (conservative: capacity stays withheld)</w:t>
+            </w:r>
+          </w:p>
+        </w:tc>
+        <w:tc>
+          <w:tcPr/>
+          <w:p>
+            <w:pPr>
+              <w:pStyle w:val="Compact"/>
+              <w:jc w:val="left"/>
+            </w:pPr>
+            <w:r>
+              <w:rPr>
+                <w:bCs/>
+                <w:b/>
+              </w:rPr>
+              <w:t xml:space="preserve">Q3</w:t>
+            </w:r>
+            <w:r>
+              <w:t xml:space="preserve">: group holding only an unreaped zombie → terminated, clean success, no quarantine, no 2 s wait</w:t>
+            </w:r>
+          </w:p>
+        </w:tc>
+      </w:tr>
+      <w:tr>
+        <w:tc>
+          <w:tcPr/>
+          <w:p>
+            <w:pPr>
+              <w:pStyle w:val="Compact"/>
+              <w:jc w:val="left"/>
+            </w:pPr>
+            <w:r>
+              <w:t xml:space="preserve">Exit handler</w:t>
+            </w:r>
+          </w:p>
+        </w:tc>
+        <w:tc>
+          <w:tcPr/>
+          <w:p>
+            <w:pPr>
+              <w:pStyle w:val="Compact"/>
+              <w:jc w:val="left"/>
+            </w:pPr>
+            <w:r>
+              <w:t xml:space="preserve">after the child exits, SIGKILL groups, then poll the probe for up to 2 s (L427)</w:t>
+            </w:r>
+          </w:p>
+        </w:tc>
+        <w:tc>
+          <w:tcPr/>
+          <w:p>
+            <w:pPr>
+              <w:pStyle w:val="Compact"/>
+              <w:jc w:val="left"/>
+            </w:pPr>
+            <w:r>
+              <w:t xml:space="preserve">E2/E3</w:t>
+            </w:r>
+          </w:p>
+        </w:tc>
+      </w:tr>
+      <w:tr>
+        <w:tc>
+          <w:tcPr/>
+          <w:p>
+            <w:pPr>
+              <w:pStyle w:val="Compact"/>
+              <w:jc w:val="left"/>
+            </w:pPr>
+            <w:r>
+              <w:t xml:space="preserve">Not confirmed</w:t>
+            </w:r>
+          </w:p>
+        </w:tc>
+        <w:tc>
+          <w:tcPr/>
+          <w:p>
+            <w:pPr>
+              <w:pStyle w:val="Compact"/>
+              <w:jc w:val="left"/>
+            </w:pPr>
+            <w:r>
+              <w:t xml:space="preserve">quarantine entry {child pid, groups, reason, withheld browser/proc/llm grants}; the grants are</w:t>
+            </w:r>
+            <w:r>
+              <w:t xml:space="preserve"> </w:t>
+            </w:r>
+            <w:r>
+              <w:rPr>
+                <w:bCs/>
+                <w:b/>
+              </w:rPr>
+              <w:t xml:space="preserve">not</w:t>
+            </w:r>
+            <w:r>
+              <w:t xml:space="preserve"> </w:t>
+            </w:r>
+            <w:r>
+              <w:t xml:space="preserve">returned; queued (ungranted) waits are aborted; the attempt settles as</w:t>
+            </w:r>
+            <w:r>
+              <w:t xml:space="preserve"> </w:t>
+            </w:r>
+            <w:r>
+              <w:rPr>
+                <w:rStyle w:val="VerbatimChar"/>
+              </w:rPr>
+              <w:t xml:space="preserve">Isolated job child cleanup unconfirmed …</w:t>
+            </w:r>
+            <w:r>
+              <w:t xml:space="preserve"> </w:t>
+            </w:r>
+            <w:r>
+              <w:t xml:space="preserve">(L436-442), which is non-retriable and is</w:t>
+            </w:r>
+            <w:r>
+              <w:t xml:space="preserve"> </w:t>
+            </w:r>
+            <w:r>
+              <w:rPr>
+                <w:bCs/>
+                <w:b/>
+              </w:rPr>
+              <w:t xml:space="preserve">never</w:t>
+            </w:r>
+            <w:r>
+              <w:t xml:space="preserve"> </w:t>
+            </w:r>
+            <w:r>
+              <w:t xml:space="preserve">a clean success, even if the child reported success</w:t>
+            </w:r>
+          </w:p>
+        </w:tc>
+        <w:tc>
+          <w:tcPr/>
+          <w:p>
+            <w:pPr>
+              <w:pStyle w:val="Compact"/>
+              <w:jc w:val="left"/>
+            </w:pPr>
+            <w:r>
+              <w:rPr>
+                <w:bCs/>
+                <w:b/>
+              </w:rPr>
+              <w:t xml:space="preserve">Q1</w:t>
+            </w:r>
+            <w:r>
+              <w:t xml:space="preserve">: reported success → rejected, browser permit not reassigned while quarantined</w:t>
+            </w:r>
+          </w:p>
+        </w:tc>
+      </w:tr>
+      <w:tr>
+        <w:tc>
+          <w:tcPr/>
+          <w:p>
+            <w:pPr>
+              <w:pStyle w:val="Compact"/>
+              <w:jc w:val="left"/>
+            </w:pPr>
+            <w:r>
+              <w:t xml:space="preserve">Background monitor</w:t>
+            </w:r>
+          </w:p>
+        </w:tc>
+        <w:tc>
+          <w:tcPr/>
+          <w:p>
+            <w:pPr>
+              <w:pStyle w:val="Compact"/>
+              <w:jc w:val="left"/>
+            </w:pPr>
+            <w:r>
+              <w:rPr>
+                <w:rStyle w:val="VerbatimChar"/>
+              </w:rPr>
+              <w:t xml:space="preserve">ensureQuarantineMonitor</w:t>
+            </w:r>
+            <w:r>
+              <w:t xml:space="preserve"> </w:t>
+            </w:r>
+            <w:r>
+              <w:t xml:space="preserve">(L158) re-probes every 5 s (</w:t>
+            </w:r>
+            <w:r>
+              <w:rPr>
+                <w:rStyle w:val="VerbatimChar"/>
+              </w:rPr>
+              <w:t xml:space="preserve">WORKER_ISOLATION_QUARANTINE_POLL_MS</w:t>
+            </w:r>
+            <w:r>
+              <w:t xml:space="preserve">) and releases the withheld permits only once termination is confirmed (</w:t>
+            </w:r>
+            <w:r>
+              <w:rPr>
+                <w:rStyle w:val="VerbatimChar"/>
+              </w:rPr>
+              <w:t xml:space="preserve">releaseQuarantined</w:t>
+            </w:r>
+            <w:r>
+              <w:t xml:space="preserve">, L150)</w:t>
+            </w:r>
+          </w:p>
+        </w:tc>
+        <w:tc>
+          <w:tcPr/>
+          <w:p>
+            <w:pPr>
+              <w:pStyle w:val="Compact"/>
+              <w:jc w:val="left"/>
+            </w:pPr>
+            <w:r>
+              <w:rPr>
+                <w:bCs/>
+                <w:b/>
+              </w:rPr>
+              <w:t xml:space="preserve">Q1</w:t>
+            </w:r>
+            <w:r>
+              <w:t xml:space="preserve"> </w:t>
+            </w:r>
+            <w:r>
+              <w:t xml:space="preserve">(released after confirmation)</w:t>
+            </w:r>
+          </w:p>
+        </w:tc>
+      </w:tr>
+      <w:tr>
+        <w:tc>
+          <w:tcPr/>
+          <w:p>
+            <w:pPr>
+              <w:pStyle w:val="Compact"/>
+              <w:jc w:val="left"/>
+            </w:pPr>
+            <w:r>
+              <w:t xml:space="preserve">Still alive</w:t>
+            </w:r>
+          </w:p>
+        </w:tc>
+        <w:tc>
+          <w:tcPr/>
+          <w:p>
+            <w:pPr>
+              <w:pStyle w:val="Compact"/>
+              <w:jc w:val="left"/>
+            </w:pPr>
+            <w:r>
+              <w:t xml:space="preserve">quarantine persists; capacity stays reduced</w:t>
+            </w:r>
+          </w:p>
+        </w:tc>
+        <w:tc>
+          <w:tcPr/>
+          <w:p>
+            <w:pPr>
+              <w:pStyle w:val="Compact"/>
+              <w:jc w:val="left"/>
+            </w:pPr>
+            <w:r>
+              <w:rPr>
+                <w:bCs/>
+                <w:b/>
+              </w:rPr>
+              <w:t xml:space="preserve">Q2</w:t>
+            </w:r>
+          </w:p>
+        </w:tc>
+      </w:tr>
+      <w:tr>
+        <w:tc>
+          <w:tcPr/>
+          <w:p>
+            <w:pPr>
+              <w:pStyle w:val="Compact"/>
+              <w:jc w:val="left"/>
+            </w:pPr>
+            <w:r>
+              <w:t xml:space="preserve">Deliberate recovery</w:t>
+            </w:r>
+          </w:p>
+        </w:tc>
+        <w:tc>
+          <w:tcPr/>
+          <w:p>
+            <w:pPr>
+              <w:pStyle w:val="Compact"/>
+              <w:jc w:val="left"/>
+            </w:pPr>
+            <w:r>
+              <w:rPr>
+                <w:rStyle w:val="VerbatimChar"/>
+              </w:rPr>
+              <w:t xml:space="preserve">recoverQuarantinedChildren(pid?)</w:t>
+            </w:r>
+            <w:r>
+              <w:t xml:space="preserve"> </w:t>
+            </w:r>
+            <w:r>
+              <w:t xml:space="preserve">(L182): SIGKILLs the groups once more and returns the permits regardless (operator action; nothing calls it automatically)</w:t>
+            </w:r>
+          </w:p>
+        </w:tc>
+        <w:tc>
+          <w:tcPr/>
+          <w:p>
+            <w:pPr>
+              <w:pStyle w:val="Compact"/>
+              <w:jc w:val="left"/>
+            </w:pPr>
+            <w:r>
+              <w:rPr>
+                <w:bCs/>
+                <w:b/>
+              </w:rPr>
+              <w:t xml:space="preserve">Q2</w:t>
+            </w:r>
+          </w:p>
+        </w:tc>
+      </w:tr>
+      <w:tr>
+        <w:tc>
+          <w:tcPr/>
+          <w:p>
+            <w:pPr>
+              <w:pStyle w:val="Compact"/>
+              <w:jc w:val="left"/>
+            </w:pPr>
+            <w:r>
+              <w:t xml:space="preserve">Parent exit</w:t>
+            </w:r>
+          </w:p>
+        </w:tc>
+        <w:tc>
+          <w:tcPr/>
+          <w:p>
+            <w:pPr>
+              <w:pStyle w:val="Compact"/>
+              <w:jc w:val="left"/>
+            </w:pPr>
+            <w:r>
+              <w:t xml:space="preserve">the exit hook SIGKILLs quarantined groups as well as live ones</w:t>
+            </w:r>
+          </w:p>
+        </w:tc>
+        <w:tc>
+          <w:tcPr/>
+          <w:p>
+            <w:pPr>
+              <w:pStyle w:val="Compact"/>
+              <w:jc w:val="left"/>
+            </w:pPr>
+            <w:r>
+              <w:t xml:space="preserve">n/a</w:t>
+            </w:r>
+          </w:p>
+        </w:tc>
+      </w:tr>
+    </w:tbl>
     <w:bookmarkEnd w:id="27"/>
+    <w:bookmarkStart w:id="28" w:name="monotonic-terminal-decision-fix-2"/>
+    <w:p>
+      <w:pPr>
+        <w:pStyle w:val="Heading2"/>
+      </w:pPr>
+      <w:r>
+        <w:t xml:space="preserve">9. Monotonic terminal decision (FIX 2)</w:t>
+      </w:r>
+    </w:p>
+    <w:p>
+      <w:pPr>
+        <w:numPr>
+          <w:ilvl w:val="0"/>
+          <w:numId w:val="1001"/>
+        </w:numPr>
+        <w:pStyle w:val="Compact"/>
+      </w:pPr>
+      <w:r>
+        <w:rPr>
+          <w:rStyle w:val="VerbatimChar"/>
+        </w:rPr>
+        <w:t xml:space="preserve">killReason</w:t>
+      </w:r>
+      <w:r>
+        <w:t xml:space="preserve"> </w:t>
+      </w:r>
+      <w:r>
+        <w:t xml:space="preserve">is set</w:t>
+      </w:r>
+      <w:r>
+        <w:t xml:space="preserve"> </w:t>
+      </w:r>
+      <w:r>
+        <w:rPr>
+          <w:bCs/>
+          <w:b/>
+        </w:rPr>
+        <w:t xml:space="preserve">once</w:t>
+      </w:r>
+      <w:r>
+        <w:t xml:space="preserve">, by the first terminal event: pipeline deadline, job deadline, cancel, or revoke (</w:t>
+      </w:r>
+      <w:r>
+        <w:rPr>
+          <w:rStyle w:val="VerbatimChar"/>
+        </w:rPr>
+        <w:t xml:space="preserve">onDeadline</w:t>
+      </w:r>
+      <w:r>
+        <w:t xml:space="preserve"> </w:t>
+      </w:r>
+      <w:r>
+        <w:t xml:space="preserve">L283). A later deadline only brings the kill forward; it does not change the reason.</w:t>
+      </w:r>
+    </w:p>
+    <w:p>
+      <w:pPr>
+        <w:numPr>
+          <w:ilvl w:val="0"/>
+          <w:numId w:val="1001"/>
+        </w:numPr>
+        <w:pStyle w:val="Compact"/>
+      </w:pPr>
+      <w:r>
+        <w:rPr>
+          <w:rStyle w:val="VerbatimChar"/>
+        </w:rPr>
+        <w:t xml:space="preserve">onReported</w:t>
+      </w:r>
+      <w:r>
+        <w:t xml:space="preserve"> </w:t>
+      </w:r>
+      <w:r>
+        <w:t xml:space="preserve">(L337) accepts a child’s result/error only if</w:t>
+      </w:r>
+      <w:r>
+        <w:t xml:space="preserve"> </w:t>
+      </w:r>
+      <w:r>
+        <w:rPr>
+          <w:rStyle w:val="VerbatimChar"/>
+        </w:rPr>
+        <w:t xml:space="preserve">killReason</w:t>
+      </w:r>
+      <w:r>
+        <w:t xml:space="preserve"> </w:t>
+      </w:r>
+      <w:r>
+        <w:t xml:space="preserve">is still null. Otherwise the report is logged (</w:t>
+      </w:r>
+      <w:r>
+        <w:rPr>
+          <w:rStyle w:val="VerbatimChar"/>
+        </w:rPr>
+        <w:t xml:space="preserve">[WORKER-ISOLATION] … reported AFTER terminal decision … discarded</w:t>
+      </w:r>
+      <w:r>
+        <w:t xml:space="preserve">), counted (</w:t>
+      </w:r>
+      <w:r>
+        <w:rPr>
+          <w:rStyle w:val="VerbatimChar"/>
+        </w:rPr>
+        <w:t xml:space="preserve">lateReportsDiscarded</w:t>
+      </w:r>
+      <w:r>
+        <w:t xml:space="preserve">), and kept in a 50-entry diagnostic ring. It never changes the outcome.</w:t>
+      </w:r>
+    </w:p>
+    <w:p>
+      <w:pPr>
+        <w:numPr>
+          <w:ilvl w:val="0"/>
+          <w:numId w:val="1001"/>
+        </w:numPr>
+        <w:pStyle w:val="Compact"/>
+      </w:pPr>
+      <w:r>
+        <w:t xml:space="preserve">A report accepted first keeps precedence, even if a deadline fires before the child exits (the deadline still kills, so nothing outlives it).</w:t>
+      </w:r>
+    </w:p>
+    <w:p>
+      <w:pPr>
+        <w:numPr>
+          <w:ilvl w:val="0"/>
+          <w:numId w:val="1001"/>
+        </w:numPr>
+        <w:pStyle w:val="Compact"/>
+      </w:pPr>
+      <w:r>
+        <w:t xml:space="preserve">Tests use ordering barriers, not sleeps: the fixture waits for a</w:t>
+      </w:r>
+      <w:r>
+        <w:t xml:space="preserve"> </w:t>
+      </w:r>
+      <w:r>
+        <w:rPr>
+          <w:rStyle w:val="VerbatimChar"/>
+        </w:rPr>
+        <w:t xml:space="preserve">FIXTURE_GO</w:t>
+      </w:r>
+      <w:r>
+        <w:t xml:space="preserve"> </w:t>
+      </w:r>
+      <w:r>
+        <w:t xml:space="preserve">file, and the test hook</w:t>
+      </w:r>
+      <w:r>
+        <w:t xml:space="preserve"> </w:t>
+      </w:r>
+      <w:r>
+        <w:rPr>
+          <w:rStyle w:val="VerbatimChar"/>
+        </w:rPr>
+        <w:t xml:space="preserve">setSuppressDeadlineKill</w:t>
+      </w:r>
+      <w:r>
+        <w:t xml:space="preserve"> </w:t>
+      </w:r>
+      <w:r>
+        <w:t xml:space="preserve">lets the deadline make its decision (and revoke) without SIGKILL so that the child can report afterwards.</w:t>
+      </w:r>
+      <w:r>
+        <w:t xml:space="preserve"> </w:t>
+      </w:r>
+      <w:r>
+        <w:rPr>
+          <w:bCs/>
+          <w:b/>
+        </w:rPr>
+        <w:t xml:space="preserve">M1</w:t>
+      </w:r>
+      <w:r>
+        <w:t xml:space="preserve"> </w:t>
+      </w:r>
+      <w:r>
+        <w:t xml:space="preserve">report→deadline = success;</w:t>
+      </w:r>
+      <w:r>
+        <w:t xml:space="preserve"> </w:t>
+      </w:r>
+      <w:r>
+        <w:rPr>
+          <w:bCs/>
+          <w:b/>
+        </w:rPr>
+        <w:t xml:space="preserve">M2</w:t>
+      </w:r>
+      <w:r>
+        <w:t xml:space="preserve"> </w:t>
+      </w:r>
+      <w:r>
+        <w:t xml:space="preserve">job deadline→report = job watchdog timeout (non-retriable);</w:t>
+      </w:r>
+      <w:r>
+        <w:t xml:space="preserve"> </w:t>
+      </w:r>
+      <w:r>
+        <w:rPr>
+          <w:bCs/>
+          <w:b/>
+        </w:rPr>
+        <w:t xml:space="preserve">M2b</w:t>
+      </w:r>
+      <w:r>
+        <w:t xml:space="preserve"> </w:t>
+      </w:r>
+      <w:r>
+        <w:t xml:space="preserve">pipeline deadline→report = pipeline timeout (retriable, existing policy);</w:t>
+      </w:r>
+      <w:r>
+        <w:t xml:space="preserve"> </w:t>
+      </w:r>
+      <w:r>
+        <w:rPr>
+          <w:bCs/>
+          <w:b/>
+        </w:rPr>
+        <w:t xml:space="preserve">M3</w:t>
+      </w:r>
+      <w:r>
+        <w:t xml:space="preserve"> </w:t>
+      </w:r>
+      <w:r>
+        <w:t xml:space="preserve">cancel→report = Cancelled.</w:t>
+      </w:r>
+    </w:p>
+    <w:bookmarkEnd w:id="28"/>
+    <w:bookmarkStart w:id="29" w:name="browser-permits-vs-chromium-instances"/>
+    <w:p>
+      <w:pPr>
+        <w:pStyle w:val="Heading2"/>
+      </w:pPr>
+      <w:r>
+        <w:t xml:space="preserve">10. Browser permits vs Chromium instances</w:t>
+      </w:r>
+    </w:p>
+    <w:tbl>
+      <w:tblPr>
+        <w:tblStyle w:val="Table"/>
+        <w:tblW w:type="pct" w:w="5000"/>
+        <w:tblLook w:firstRow="1" w:lastRow="0" w:firstColumn="0" w:lastColumn="0" w:noHBand="0" w:noVBand="0" w:val="0020"/>
+        <w:jc w:val="start"/>
+      </w:tblPr>
+      <w:tblGrid>
+        <w:gridCol w:w="2640"/>
+        <w:gridCol w:w="2640"/>
+        <w:gridCol w:w="2640"/>
+      </w:tblGrid>
+      <w:tr>
+        <w:trPr>
+          <w:tblHeader w:val="true"/>
+        </w:trPr>
+        <w:tc>
+          <w:tcPr/>
+          <w:p>
+            <w:pPr>
+              <w:pStyle w:val="Compact"/>
+              <w:jc w:val="left"/>
+            </w:pPr>
+            <w:r>
+              <w:t xml:space="preserve">Item</w:t>
+            </w:r>
+          </w:p>
+        </w:tc>
+        <w:tc>
+          <w:tcPr/>
+          <w:p>
+            <w:pPr>
+              <w:pStyle w:val="Compact"/>
+              <w:jc w:val="left"/>
+            </w:pPr>
+            <w:r>
+              <w:t xml:space="preserve">Baseline</w:t>
+            </w:r>
+            <w:r>
+              <w:t xml:space="preserve"> </w:t>
+            </w:r>
+            <w:r>
+              <w:rPr>
+                <w:rStyle w:val="VerbatimChar"/>
+              </w:rPr>
+              <w:t xml:space="preserve">35884ee</w:t>
+            </w:r>
+            <w:r>
+              <w:t xml:space="preserve"> </w:t>
+            </w:r>
+            <w:r>
+              <w:t xml:space="preserve">(in-process)</w:t>
+            </w:r>
+          </w:p>
+        </w:tc>
+        <w:tc>
+          <w:tcPr/>
+          <w:p>
+            <w:pPr>
+              <w:pStyle w:val="Compact"/>
+              <w:jc w:val="left"/>
+            </w:pPr>
+            <w:r>
+              <w:t xml:space="preserve">Isolation on</w:t>
+            </w:r>
+          </w:p>
+        </w:tc>
+      </w:tr>
+      <w:tr>
+        <w:tc>
+          <w:tcPr/>
+          <w:p>
+            <w:pPr>
+              <w:pStyle w:val="Compact"/>
+              <w:jc w:val="left"/>
+            </w:pPr>
+            <w:r>
+              <w:t xml:space="preserve">Concurrent browser page fetches per replica</w:t>
+            </w:r>
+          </w:p>
+        </w:tc>
+        <w:tc>
+          <w:tcPr/>
+          <w:p>
+            <w:pPr>
+              <w:pStyle w:val="Compact"/>
+              <w:jc w:val="left"/>
+            </w:pPr>
+            <w:r>
+              <w:rPr>
+                <w:rStyle w:val="VerbatimChar"/>
+              </w:rPr>
+              <w:t xml:space="preserve">MAX_CONCURRENT_BROWSER</w:t>
+            </w:r>
+            <w:r>
+              <w:t xml:space="preserve"> </w:t>
+            </w:r>
+            <w:r>
+              <w:t xml:space="preserve">= 1</w:t>
+            </w:r>
+          </w:p>
+        </w:tc>
+        <w:tc>
+          <w:tcPr/>
+          <w:p>
+            <w:pPr>
+              <w:pStyle w:val="Compact"/>
+              <w:jc w:val="left"/>
+            </w:pPr>
+            <w:r>
+              <w:t xml:space="preserve">1, brokered by the parent (test 5; integration broker state</w:t>
+            </w:r>
+            <w:r>
+              <w:t xml:space="preserve"> </w:t>
+            </w:r>
+            <w:r>
+              <w:rPr>
+                <w:rStyle w:val="VerbatimChar"/>
+              </w:rPr>
+              <w:t xml:space="preserve">browser.active=0</w:t>
+            </w:r>
+            <w:r>
+              <w:t xml:space="preserve"> </w:t>
+            </w:r>
+            <w:r>
+              <w:t xml:space="preserve">after completion)</w:t>
+            </w:r>
+          </w:p>
+        </w:tc>
+      </w:tr>
+      <w:tr>
+        <w:tc>
+          <w:tcPr/>
+          <w:p>
+            <w:pPr>
+              <w:pStyle w:val="Compact"/>
+              <w:jc w:val="left"/>
+            </w:pPr>
+            <w:r>
+              <w:t xml:space="preserve">Chromium</w:t>
+            </w:r>
+            <w:r>
+              <w:t xml:space="preserve"> </w:t>
+            </w:r>
+            <w:r>
+              <w:rPr>
+                <w:bCs/>
+                <w:b/>
+              </w:rPr>
+              <w:t xml:space="preserve">instances</w:t>
+            </w:r>
+            <w:r>
+              <w:t xml:space="preserve"> </w:t>
+            </w:r>
+            <w:r>
+              <w:t xml:space="preserve">per replica</w:t>
+            </w:r>
+          </w:p>
+        </w:tc>
+        <w:tc>
+          <w:tcPr/>
+          <w:p>
+            <w:pPr>
+              <w:pStyle w:val="Compact"/>
+              <w:jc w:val="left"/>
+            </w:pPr>
+            <w:r>
+              <w:t xml:space="preserve">1 shared instance for the whole worker</w:t>
+            </w:r>
+          </w:p>
+        </w:tc>
+        <w:tc>
+          <w:tcPr/>
+          <w:p>
+            <w:pPr>
+              <w:pStyle w:val="Compact"/>
+              <w:jc w:val="left"/>
+            </w:pPr>
+            <w:r>
+              <w:rPr>
+                <w:bCs/>
+                <w:b/>
+              </w:rPr>
+              <w:t xml:space="preserve">1 per job child that used the browser</w:t>
+            </w:r>
+            <w:r>
+              <w:t xml:space="preserve">, alive until that child exits (the shared-browser singleton is per process). Up to</w:t>
+            </w:r>
+            <w:r>
+              <w:t xml:space="preserve"> </w:t>
+            </w:r>
+            <w:r>
+              <w:rPr>
+                <w:rStyle w:val="VerbatimChar"/>
+              </w:rPr>
+              <w:t xml:space="preserve">WORKER_CONCURRENCY</w:t>
+            </w:r>
+            <w:r>
+              <w:t xml:space="preserve"> </w:t>
+            </w:r>
+            <w:r>
+              <w:t xml:space="preserve">instances (4 in production)</w:t>
+            </w:r>
+          </w:p>
+        </w:tc>
+      </w:tr>
+      <w:tr>
+        <w:tc>
+          <w:tcPr/>
+          <w:p>
+            <w:pPr>
+              <w:pStyle w:val="Compact"/>
+              <w:jc w:val="left"/>
+            </w:pPr>
+            <w:r>
+              <w:t xml:space="preserve">Measured (integration, 2 children, real Chromium)</w:t>
+            </w:r>
+          </w:p>
+        </w:tc>
+        <w:tc>
+          <w:tcPr/>
+          <w:p>
+            <w:pPr>
+              <w:pStyle w:val="Compact"/>
+              <w:jc w:val="left"/>
+            </w:pPr>
+            <w:r>
+              <w:t xml:space="preserve">n/a</w:t>
+            </w:r>
+          </w:p>
+        </w:tc>
+        <w:tc>
+          <w:tcPr/>
+          <w:p>
+            <w:pPr>
+              <w:pStyle w:val="Compact"/>
+              <w:jc w:val="left"/>
+            </w:pPr>
+            <w:r>
+              <w:t xml:space="preserve">peak</w:t>
+            </w:r>
+            <w:r>
+              <w:t xml:space="preserve"> </w:t>
+            </w:r>
+            <w:r>
+              <w:rPr>
+                <w:bCs/>
+                <w:b/>
+              </w:rPr>
+              <w:t xml:space="preserve">18 Chromium processes</w:t>
+            </w:r>
+            <w:r>
+              <w:t xml:space="preserve">, summed RSS</w:t>
+            </w:r>
+            <w:r>
+              <w:t xml:space="preserve"> </w:t>
+            </w:r>
+            <w:r>
+              <w:rPr>
+                <w:bCs/>
+                <w:b/>
+              </w:rPr>
+              <w:t xml:space="preserve">2401 MB</w:t>
+            </w:r>
+            <w:r>
+              <w:t xml:space="preserve"> </w:t>
+            </w:r>
+            <w:r>
+              <w:t xml:space="preserve">(sum of per-process RSS; shared pages are counted more than once, so this overstates real memory); all descendants together 2801 MB; parent 210-238 MB</w:t>
+            </w:r>
+          </w:p>
+        </w:tc>
+      </w:tr>
+    </w:tbl>
+    <w:p>
+      <w:pPr>
+        <w:pStyle w:val="BodyText"/>
+      </w:pPr>
+      <w:r>
+        <w:t xml:space="preserve">The permit limits concurrent fetches, not instances. The memory cost of one Chromium per child is the main staging risk and is</w:t>
+      </w:r>
+      <w:r>
+        <w:t xml:space="preserve"> </w:t>
+      </w:r>
+      <w:r>
+        <w:rPr>
+          <w:bCs/>
+          <w:b/>
+        </w:rPr>
+        <w:t xml:space="preserve">not</w:t>
+      </w:r>
+      <w:r>
+        <w:t xml:space="preserve"> </w:t>
+      </w:r>
+      <w:r>
+        <w:t xml:space="preserve">solved by this branch.</w:t>
+      </w:r>
+    </w:p>
+    <w:bookmarkEnd w:id="29"/>
+    <w:bookmarkEnd w:id="30"/>
     <w:sectPr/>
   </w:body>
 </w:document>
@@ -4721,8 +6089,87 @@
       </w:pPr>
     </w:lvl>
   </w:abstractNum>
+  <w:abstractNum w:abstractNumId="991">
+    <w:nsid w:val="A991"/>
+    <w:multiLevelType w:val="multilevel"/>
+    <w:lvl w:ilvl="0">
+      <w:numFmt w:val="bullet"/>
+      <w:lvlText w:val="•"/>
+      <w:lvlJc w:val="left"/>
+      <w:pPr>
+        <w:ind w:left="720" w:hanging="480"/>
+      </w:pPr>
+    </w:lvl>
+    <w:lvl w:ilvl="1">
+      <w:numFmt w:val="bullet"/>
+      <w:lvlText w:val="–"/>
+      <w:lvlJc w:val="left"/>
+      <w:pPr>
+        <w:ind w:left="1440" w:hanging="480"/>
+      </w:pPr>
+    </w:lvl>
+    <w:lvl w:ilvl="2">
+      <w:numFmt w:val="bullet"/>
+      <w:lvlText w:val="•"/>
+      <w:lvlJc w:val="left"/>
+      <w:pPr>
+        <w:ind w:left="2160" w:hanging="480"/>
+      </w:pPr>
+    </w:lvl>
+    <w:lvl w:ilvl="3">
+      <w:numFmt w:val="bullet"/>
+      <w:lvlText w:val="–"/>
+      <w:lvlJc w:val="left"/>
+      <w:pPr>
+        <w:ind w:left="2880" w:hanging="480"/>
+      </w:pPr>
+    </w:lvl>
+    <w:lvl w:ilvl="4">
+      <w:numFmt w:val="bullet"/>
+      <w:lvlText w:val="•"/>
+      <w:lvlJc w:val="left"/>
+      <w:pPr>
+        <w:ind w:left="3600" w:hanging="480"/>
+      </w:pPr>
+    </w:lvl>
+    <w:lvl w:ilvl="5">
+      <w:numFmt w:val="bullet"/>
+      <w:lvlText w:val="–"/>
+      <w:lvlJc w:val="left"/>
+      <w:pPr>
+        <w:ind w:left="4320" w:hanging="480"/>
+      </w:pPr>
+    </w:lvl>
+    <w:lvl w:ilvl="6">
+      <w:numFmt w:val="bullet"/>
+      <w:lvlText w:val="•"/>
+      <w:lvlJc w:val="left"/>
+      <w:pPr>
+        <w:ind w:left="5040" w:hanging="480"/>
+      </w:pPr>
+    </w:lvl>
+    <w:lvl w:ilvl="7">
+      <w:numFmt w:val="bullet"/>
+      <w:lvlText w:val="–"/>
+      <w:lvlJc w:val="left"/>
+      <w:pPr>
+        <w:ind w:left="5760" w:hanging="480"/>
+      </w:pPr>
+    </w:lvl>
+    <w:lvl w:ilvl="8">
+      <w:numFmt w:val="bullet"/>
+      <w:lvlText w:val="•"/>
+      <w:lvlJc w:val="left"/>
+      <w:pPr>
+        <w:ind w:left="6480" w:hanging="480"/>
+      </w:pPr>
+    </w:lvl>
+  </w:abstractNum>
   <w:num w:numId="1000">
     <w:abstractNumId w:val="990"/>
+  </w:num>
+  <w:num w:numId="1001">
+    <w:abstractNumId w:val="991"/>
   </w:num>
 </w:numbering>
 </file>

</xml_diff>